<commit_message>
feat: consume civiccore scheduling helpers
</commit_message>
<xml_diff>
--- a/README.docx
+++ b/README.docx
@@ -40,7 +40,7 @@
           <w:color w:val="6B7280"/>
           <w:sz w:val="22"/>
         </w:rPr>
-        <w:t>v1.4.1  ·  April 2026  ·  Apache 2.0</w:t>
+        <w:t>v1.4.8  ·  May 2026  ·  Apache 2.0</w:t>
       </w:r>
     </w:p>
     <w:p/>
@@ -4509,7 +4509,7 @@
           <w:i w:val="0"/>
           <w:sz w:val="22"/>
         </w:rPr>
-        <w:t>v1.4.1 — Patch release aligning CivicRecords AI with civiccore 0.3.0 while preserving the records-ai runtime surface from v1.4.0.</w:t>
+        <w:t>v1.4.8 — Patch release aligning CivicRecords AI with civiccore 0.21.0 while preserving the records-ai runtime surface and moving reusable schedule validation into CivicCore.</w:t>
       </w:r>
     </w:p>
     <w:p>
@@ -4593,7 +4593,7 @@
           <w:rFonts w:ascii="Calibri" w:hAnsi="Calibri"/>
           <w:sz w:val="22"/>
         </w:rPr>
-        <w:t>617 backend + 36 frontend automated tests passing</w:t>
+        <w:t>627 backend + 36 frontend automated tests passing</w:t>
       </w:r>
     </w:p>
     <w:p>
@@ -4724,7 +4724,7 @@
         <w:color w:val="2563EB"/>
         <w:sz w:val="18"/>
       </w:rPr>
-      <w:t>CivicRecords AI  |  v1.4.1  |  Open-Source Municipal Records AI</w:t>
+      <w:t>CivicRecords AI  |  v1.4.8  |  Open-Source Municipal Records AI</w:t>
     </w:r>
   </w:p>
 </w:hdr>

</xml_diff>